<commit_message>
feat: daily SEO, GEO, AEO optimization update for 29 Oct 2026
</commit_message>
<xml_diff>
--- a/Cieloria_SEO_GEO_AEO_Audit_Report.docx
+++ b/Cieloria_SEO_GEO_AEO_Audit_Report.docx
@@ -34,7 +34,7 @@
         <w:t xml:space="preserve">Audit Date: </w:t>
       </w:r>
       <w:r>
-        <w:t xml:space="preserve">October 28, 2026 | </w:t>
+        <w:t xml:space="preserve">October 29, 2026 | </w:t>
       </w:r>
       <w:r>
         <w:rPr>
@@ -264,7 +264,7 @@
         <w:t xml:space="preserve">• Updated Sitemap.xml &amp; Crawl Directives: </w:t>
       </w:r>
       <w:r>
-        <w:t xml:space="preserve">Updated sitemap.xml across root, public/, and dist/ directories with lastmod set to September 18, 2026.</w:t>
+        <w:t xml:space="preserve">Updated sitemap.xml across root, public/, and dist/ directories with lastmod set to October 29, 2026.</w:t>
       </w:r>
     </w:p>
     <w:p>

</xml_diff>

<commit_message>
feat: daily SEO, GEO, AEO optimization and trending Diwali Card Party & Bhai Dooj viral blogs for 30 Oct 2026
</commit_message>
<xml_diff>
--- a/Cieloria_SEO_GEO_AEO_Audit_Report.docx
+++ b/Cieloria_SEO_GEO_AEO_Audit_Report.docx
@@ -34,7 +34,7 @@
         <w:t xml:space="preserve">Audit Date: </w:t>
       </w:r>
       <w:r>
-        <w:t xml:space="preserve">October 29, 2026 | </w:t>
+        <w:t xml:space="preserve">October 30, 2026 | </w:t>
       </w:r>
       <w:r>
         <w:rPr>
@@ -246,10 +246,25 @@
           <w:b/>
           <w:bCs/>
         </w:rPr>
+        <w:t xml:space="preserve">• Festive Viral Blogs &amp; Market Trends: </w:t>
+      </w:r>
+      <w:r>
+        <w:t xml:space="preserve">Published 2 high-conversion viral blog posts: 'Diwali Card Party &amp; Cocktail Glam: 7 Waterproof 18K Gold Stacks' and 'Bhai Dooj 2026 Gifting Guide: 18K Anti-Tarnish Demi-Fine Over Mithai &amp; Cash'.</w:t>
+      </w:r>
+    </w:p>
+    <w:p>
+      <w:pPr>
+        <w:spacing w:after="100"/>
+      </w:pPr>
+      <w:r>
+        <w:rPr>
+          <w:b/>
+          <w:bCs/>
+        </w:rPr>
         <w:t xml:space="preserve">• Expanded AI Generative FAQ Schemas: </w:t>
       </w:r>
       <w:r>
-        <w:t xml:space="preserve">Added high-intent questions defining demi-fine jewelry vs imitation items, and highlighting Cieloria's 1-Year Anti-Tarnish Replacement Warranty.</w:t>
+        <w:t xml:space="preserve">Added high-intent questions for Bhai Dooj direct luxury gifting and Diwali card party cocktail/sweatproof jewelry performance.</w:t>
       </w:r>
     </w:p>
     <w:p>
@@ -264,7 +279,7 @@
         <w:t xml:space="preserve">• Updated Sitemap.xml &amp; Crawl Directives: </w:t>
       </w:r>
       <w:r>
-        <w:t xml:space="preserve">Updated sitemap.xml across root, public/, and dist/ directories with lastmod set to October 29, 2026.</w:t>
+        <w:t xml:space="preserve">Updated sitemap.xml across root, public/, and dist/ directories with new blog URLs and lastmod set to October 30, 2026.</w:t>
       </w:r>
     </w:p>
     <w:p>

</xml_diff>